<commit_message>
Piece 7: Erratas resolved
</commit_message>
<xml_diff>
--- a/Working Folder/7 Fung Dic-lun Gordon 冯迪伦 - Arise, You Lion of Glory! 狮舞弄清韻/7_Front-Matter.docx
+++ b/Working Folder/7 Fung Dic-lun Gordon 冯迪伦 - Arise, You Lion of Glory! 狮舞弄清韻/7_Front-Matter.docx
@@ -312,6 +312,7 @@
       <w:r>
         <w:rPr>
           <w:rFonts w:ascii="Noto Serif SC" w:eastAsia="Noto Serif SC" w:hAnsi="Noto Serif SC" w:cs="STKaiti"/>
+          <w:noProof/>
           <w:sz w:val="144"/>
           <w:szCs w:val="72"/>
           <w:lang w:val="en-GB"/>
@@ -1695,6 +1696,7 @@
           <w:rFonts w:ascii="Noto Serif SC" w:eastAsia="Noto Serif SC" w:hAnsi="Noto Serif SC" w:cs="Noto Serif"/>
           <w:b/>
           <w:bCs/>
+          <w:noProof/>
           <w:sz w:val="24"/>
           <w:szCs w:val="24"/>
           <w:lang w:val="en-GB"/>
@@ -1972,7 +1974,27 @@
           <w:szCs w:val="24"/>
           <w:lang w:val="en-GB"/>
         </w:rPr>
-        <w:t>s works have been performed by guanzi virtuoso Guo Ya-</w:t>
+        <w:t xml:space="preserve">s works have been performed by </w:t>
+      </w:r>
+      <w:proofErr w:type="spellStart"/>
+      <w:r>
+        <w:rPr>
+          <w:rFonts w:ascii="Noto Serif SC" w:eastAsia="Noto Serif SC" w:hAnsi="Noto Serif SC" w:cs="Noto Serif"/>
+          <w:sz w:val="24"/>
+          <w:szCs w:val="24"/>
+          <w:lang w:val="en-GB"/>
+        </w:rPr>
+        <w:t>guanzi</w:t>
+      </w:r>
+      <w:proofErr w:type="spellEnd"/>
+      <w:r>
+        <w:rPr>
+          <w:rFonts w:ascii="Noto Serif SC" w:eastAsia="Noto Serif SC" w:hAnsi="Noto Serif SC" w:cs="Noto Serif"/>
+          <w:sz w:val="24"/>
+          <w:szCs w:val="24"/>
+          <w:lang w:val="en-GB"/>
+        </w:rPr>
+        <w:t xml:space="preserve"> virtuoso Guo Ya-</w:t>
       </w:r>
       <w:proofErr w:type="spellStart"/>
       <w:r>
@@ -3466,7 +3488,25 @@
           <w:szCs w:val="21"/>
           <w:lang w:val="en-GB"/>
         </w:rPr>
-        <w:t>II: 云锣 Yunluo, 颤音琴 Vibraphone</w:t>
+        <w:t xml:space="preserve">II: 云锣 Yunluo, </w:t>
+      </w:r>
+      <w:r>
+        <w:rPr>
+          <w:rFonts w:ascii="Noto Serif SC" w:eastAsia="Noto Serif SC" w:hAnsi="Noto Serif SC" w:cs="Noto Serif"/>
+          <w:sz w:val="20"/>
+          <w:szCs w:val="20"/>
+          <w:lang w:val="en-GB"/>
+        </w:rPr>
+        <w:t>铝板琴</w:t>
+      </w:r>
+      <w:r>
+        <w:rPr>
+          <w:rFonts w:ascii="Noto Serif SC" w:eastAsia="Noto Serif SC" w:hAnsi="Noto Serif SC" w:cs="Noto Serif"/>
+          <w:sz w:val="21"/>
+          <w:szCs w:val="21"/>
+          <w:lang w:val="en-GB"/>
+        </w:rPr>
+        <w:t>Vibraphone</w:t>
       </w:r>
     </w:p>
     <w:p>
@@ -3569,7 +3609,25 @@
           <w:szCs w:val="21"/>
           <w:lang w:val="en-GB"/>
         </w:rPr>
-        <w:t xml:space="preserve">Small </w:t>
+        <w:t>Small</w:t>
+      </w:r>
+      <w:r>
+        <w:rPr>
+          <w:rFonts w:ascii="Noto Serif SC" w:eastAsia="Noto Serif SC" w:hAnsi="Noto Serif SC" w:cs="Noto Serif"/>
+          <w:sz w:val="21"/>
+          <w:szCs w:val="21"/>
+          <w:lang w:val="en-GB"/>
+        </w:rPr>
+        <w:t>/Large</w:t>
+      </w:r>
+      <w:r>
+        <w:rPr>
+          <w:rFonts w:ascii="Noto Serif SC" w:eastAsia="Noto Serif SC" w:hAnsi="Noto Serif SC" w:cs="Noto Serif"/>
+          <w:sz w:val="21"/>
+          <w:szCs w:val="21"/>
+          <w:lang w:val="en-GB"/>
+        </w:rPr>
+        <w:t xml:space="preserve"> </w:t>
       </w:r>
       <w:r>
         <w:rPr>
@@ -3856,7 +3914,43 @@
           <w:szCs w:val="21"/>
           <w:lang w:val="en-GB"/>
         </w:rPr>
-        <w:t xml:space="preserve">VI: 低音军鼓 Diyin </w:t>
+        <w:t xml:space="preserve">VI: </w:t>
+      </w:r>
+      <w:r>
+        <w:rPr>
+          <w:rFonts w:ascii="Noto Serif SC" w:eastAsia="Noto Serif SC" w:hAnsi="Noto Serif SC" w:cs="Noto Serif" w:hint="eastAsia"/>
+          <w:sz w:val="21"/>
+          <w:szCs w:val="21"/>
+          <w:lang w:val="en-GB"/>
+        </w:rPr>
+        <w:t>大</w:t>
+      </w:r>
+      <w:r>
+        <w:rPr>
+          <w:rFonts w:ascii="Noto Serif SC" w:eastAsia="Noto Serif SC" w:hAnsi="Noto Serif SC" w:cs="Noto Serif"/>
+          <w:sz w:val="21"/>
+          <w:szCs w:val="21"/>
+          <w:lang w:val="en-GB"/>
+        </w:rPr>
+        <w:t xml:space="preserve">军鼓 </w:t>
+      </w:r>
+      <w:r>
+        <w:rPr>
+          <w:rFonts w:ascii="Noto Serif SC" w:eastAsia="Noto Serif SC" w:hAnsi="Noto Serif SC" w:cs="Noto Serif"/>
+          <w:sz w:val="21"/>
+          <w:szCs w:val="21"/>
+          <w:lang w:val="en-GB"/>
+        </w:rPr>
+        <w:t>Bass Drum</w:t>
+      </w:r>
+      <w:r>
+        <w:rPr>
+          <w:rFonts w:ascii="Noto Serif SC" w:eastAsia="Noto Serif SC" w:hAnsi="Noto Serif SC" w:cs="Noto Serif"/>
+          <w:sz w:val="21"/>
+          <w:szCs w:val="21"/>
+          <w:lang w:val="en-GB"/>
+        </w:rPr>
+        <w:t xml:space="preserve">, 狮钹 </w:t>
       </w:r>
       <w:proofErr w:type="spellStart"/>
       <w:r>
@@ -3866,7 +3960,7 @@
           <w:szCs w:val="21"/>
           <w:lang w:val="en-GB"/>
         </w:rPr>
-        <w:t>Jungu</w:t>
+        <w:t>Shibo</w:t>
       </w:r>
       <w:proofErr w:type="spellEnd"/>
       <w:r>
@@ -3876,6 +3970,24 @@
           <w:szCs w:val="21"/>
           <w:lang w:val="en-GB"/>
         </w:rPr>
+        <w:t xml:space="preserve">, 高音木鱼 High </w:t>
+      </w:r>
+      <w:r>
+        <w:rPr>
+          <w:rFonts w:ascii="Noto Serif SC" w:eastAsia="Noto Serif SC" w:hAnsi="Noto Serif SC" w:cs="Noto Serif"/>
+          <w:sz w:val="21"/>
+          <w:szCs w:val="21"/>
+          <w:lang w:val="en-GB"/>
+        </w:rPr>
+        <w:t>Woodblock</w:t>
+      </w:r>
+      <w:r>
+        <w:rPr>
+          <w:rFonts w:ascii="Noto Serif SC" w:eastAsia="Noto Serif SC" w:hAnsi="Noto Serif SC" w:cs="Noto Serif"/>
+          <w:sz w:val="21"/>
+          <w:szCs w:val="21"/>
+          <w:lang w:val="en-GB"/>
+        </w:rPr>
         <w:t xml:space="preserve">, 狮钹 </w:t>
       </w:r>
       <w:proofErr w:type="spellStart"/>
@@ -3896,57 +4008,35 @@
           <w:szCs w:val="21"/>
           <w:lang w:val="en-GB"/>
         </w:rPr>
-        <w:t xml:space="preserve">, 高音木鱼 High </w:t>
-      </w:r>
-      <w:r>
-        <w:rPr>
-          <w:rFonts w:ascii="Noto Serif SC" w:eastAsia="Noto Serif SC" w:hAnsi="Noto Serif SC" w:cs="Noto Serif"/>
-          <w:sz w:val="21"/>
-          <w:szCs w:val="21"/>
-          <w:lang w:val="en-GB"/>
-        </w:rPr>
-        <w:t>Woodblock</w:t>
-      </w:r>
-      <w:r>
-        <w:rPr>
-          <w:rFonts w:ascii="Noto Serif SC" w:eastAsia="Noto Serif SC" w:hAnsi="Noto Serif SC" w:cs="Noto Serif"/>
-          <w:sz w:val="21"/>
-          <w:szCs w:val="21"/>
-          <w:lang w:val="en-GB"/>
-        </w:rPr>
-        <w:t xml:space="preserve">, 狮钹 </w:t>
-      </w:r>
-      <w:proofErr w:type="spellStart"/>
-      <w:r>
-        <w:rPr>
-          <w:rFonts w:ascii="Noto Serif SC" w:eastAsia="Noto Serif SC" w:hAnsi="Noto Serif SC" w:cs="Noto Serif"/>
-          <w:sz w:val="21"/>
-          <w:szCs w:val="21"/>
-          <w:lang w:val="en-GB"/>
-        </w:rPr>
-        <w:t>Shibo</w:t>
-      </w:r>
-      <w:proofErr w:type="spellEnd"/>
-      <w:r>
-        <w:rPr>
-          <w:rFonts w:ascii="Noto Serif SC" w:eastAsia="Noto Serif SC" w:hAnsi="Noto Serif SC" w:cs="Noto Serif"/>
-          <w:sz w:val="21"/>
-          <w:szCs w:val="21"/>
-          <w:lang w:val="en-GB"/>
-        </w:rPr>
-        <w:t xml:space="preserve">, 军钹 </w:t>
-      </w:r>
-      <w:proofErr w:type="spellStart"/>
-      <w:r>
-        <w:rPr>
-          <w:rFonts w:ascii="Noto Serif SC" w:eastAsia="Noto Serif SC" w:hAnsi="Noto Serif SC" w:cs="Noto Serif"/>
-          <w:sz w:val="21"/>
-          <w:szCs w:val="21"/>
-          <w:lang w:val="en-GB"/>
-        </w:rPr>
-        <w:t>Junbo</w:t>
-      </w:r>
-      <w:proofErr w:type="spellEnd"/>
+        <w:t xml:space="preserve">, </w:t>
+      </w:r>
+      <w:r>
+        <w:rPr>
+          <w:rFonts w:ascii="Noto Serif SC" w:eastAsia="Noto Serif SC" w:hAnsi="Noto Serif SC" w:cs="Noto Serif" w:hint="eastAsia"/>
+          <w:sz w:val="21"/>
+          <w:szCs w:val="21"/>
+          <w:lang w:val="en-GB"/>
+        </w:rPr>
+        <w:t>西洋察</w:t>
+      </w:r>
+      <w:r>
+        <w:rPr>
+          <w:rFonts w:ascii="Noto Serif SC" w:eastAsia="Noto Serif SC" w:hAnsi="Noto Serif SC" w:cs="Noto Serif"/>
+          <w:sz w:val="21"/>
+          <w:szCs w:val="21"/>
+          <w:lang w:val="en-GB"/>
+        </w:rPr>
+        <w:t xml:space="preserve"> </w:t>
+      </w:r>
+      <w:r>
+        <w:rPr>
+          <w:rFonts w:ascii="Noto Serif SC" w:eastAsia="Noto Serif SC" w:hAnsi="Noto Serif SC" w:cs="Noto Serif"/>
+          <w:sz w:val="21"/>
+          <w:szCs w:val="21"/>
+          <w:lang w:val="en-GB"/>
+        </w:rPr>
+        <w:t>Cymbals</w:t>
+      </w:r>
     </w:p>
     <w:p>
       <w:pPr>
@@ -3983,19 +4073,35 @@
           <w:szCs w:val="21"/>
           <w:lang w:val="en-GB"/>
         </w:rPr>
-        <w:t xml:space="preserve">oar, 低音大锣 Diyin </w:t>
-      </w:r>
-      <w:proofErr w:type="spellStart"/>
-      <w:r>
-        <w:rPr>
-          <w:rFonts w:ascii="Noto Serif SC" w:eastAsia="Noto Serif SC" w:hAnsi="Noto Serif SC" w:cs="Noto Serif"/>
-          <w:sz w:val="21"/>
-          <w:szCs w:val="21"/>
-          <w:lang w:val="en-GB"/>
-        </w:rPr>
-        <w:t>Daluo</w:t>
-      </w:r>
-      <w:proofErr w:type="spellEnd"/>
+        <w:t xml:space="preserve">oar, </w:t>
+      </w:r>
+      <w:r>
+        <w:rPr>
+          <w:rFonts w:ascii="Noto Serif SC" w:eastAsia="Noto Serif SC" w:hAnsi="Noto Serif SC" w:cs="Noto Serif" w:hint="eastAsia"/>
+          <w:sz w:val="21"/>
+          <w:szCs w:val="21"/>
+          <w:lang w:val="en-GB"/>
+        </w:rPr>
+        <w:t>低音锣</w:t>
+      </w:r>
+      <w:r>
+        <w:rPr>
+          <w:rFonts w:ascii="Noto Serif SC" w:eastAsia="Noto Serif SC" w:hAnsi="Noto Serif SC" w:cs="Noto Serif"/>
+          <w:sz w:val="21"/>
+          <w:szCs w:val="21"/>
+          <w:lang w:val="en-GB"/>
+        </w:rPr>
+        <w:t xml:space="preserve"> </w:t>
+      </w:r>
+      <w:r>
+        <w:rPr>
+          <w:rFonts w:ascii="Noto Serif SC" w:eastAsia="Noto Serif SC" w:hAnsi="Noto Serif SC" w:cs="Noto Serif"/>
+          <w:sz w:val="21"/>
+          <w:szCs w:val="21"/>
+          <w:lang w:val="en-GB"/>
+        </w:rPr>
+        <w:t>Tam-tam</w:t>
+      </w:r>
       <w:r>
         <w:rPr>
           <w:rFonts w:ascii="Noto Serif SC" w:eastAsia="Noto Serif SC" w:hAnsi="Noto Serif SC" w:cs="Noto Serif"/>

</xml_diff>